<commit_message>
Update 08 Thinking and problem solving.docx
</commit_message>
<xml_diff>
--- a/08 Thinking and problem solving.docx
+++ b/08 Thinking and problem solving.docx
@@ -45,7 +45,7 @@
         <w:rPr>
           <w:lang w:val="it-IT"/>
         </w:rPr>
-        <w:t>:</w:t>
+        <w:t xml:space="preserve">: </w:t>
       </w:r>
     </w:p>
     <w:p>
@@ -53,17 +53,21 @@
         <w:pStyle w:val="ListParagraph"/>
         <w:numPr>
           <w:ilvl w:val="0"/>
-          <w:numId w:val="1"/>
+          <w:numId w:val="2"/>
         </w:numPr>
       </w:pPr>
       <w:r>
-        <w:t>Problem solving : How people solve complex and simple problems a</w:t>
-      </w:r>
-      <w:r>
-        <w:t>nd generate solutions</w:t>
-      </w:r>
-      <w:r>
-        <w:t xml:space="preserve"> </w:t>
+        <w:rPr>
+          <w:b/>
+          <w:bCs/>
+        </w:rPr>
+        <w:t xml:space="preserve">Problem solving : </w:t>
+      </w:r>
+      <w:r>
+        <w:t xml:space="preserve">How people solve </w:t>
+      </w:r>
+      <w:r>
+        <w:t>simple problems to complex problems.</w:t>
       </w:r>
     </w:p>
     <w:p>
@@ -71,14 +75,18 @@
         <w:pStyle w:val="ListParagraph"/>
         <w:numPr>
           <w:ilvl w:val="0"/>
-          <w:numId w:val="1"/>
+          <w:numId w:val="2"/>
         </w:numPr>
       </w:pPr>
       <w:r>
-        <w:t>Creativity : The way people co</w:t>
-      </w:r>
-      <w:r>
-        <w:t>me up with novel ideas</w:t>
+        <w:rPr>
+          <w:b/>
+          <w:bCs/>
+        </w:rPr>
+        <w:t>Creativity :</w:t>
+      </w:r>
+      <w:r>
+        <w:t xml:space="preserve"> Form of problem solving studying how people come up with novel ideas</w:t>
       </w:r>
     </w:p>
     <w:p>
@@ -86,32 +94,249 @@
         <w:pStyle w:val="ListParagraph"/>
         <w:numPr>
           <w:ilvl w:val="0"/>
-          <w:numId w:val="1"/>
+          <w:numId w:val="2"/>
         </w:numPr>
       </w:pPr>
       <w:r>
-        <w:t>Analogy making : How knowledge acquired b</w:t>
-      </w:r>
-      <w:r>
-        <w:t xml:space="preserve">y solving a type of problem helps solve other types of problems. </w:t>
-      </w:r>
-    </w:p>
-    <w:p>
-      <w:pPr>
-        <w:rPr>
-          <w:b/>
-          <w:bCs/>
-        </w:rPr>
-      </w:pPr>
-      <w:r>
-        <w:rPr>
-          <w:b/>
-          <w:bCs/>
-        </w:rPr>
-        <w:t>8.2 problem solving</w:t>
+        <w:rPr>
+          <w:b/>
+          <w:bCs/>
+        </w:rPr>
+        <w:t xml:space="preserve">Analogy-making : </w:t>
+      </w:r>
+      <w:r>
+        <w:t xml:space="preserve">How knowledge acquired when solving a certain type of problem is used in another type of problem. </w:t>
+      </w:r>
+    </w:p>
+    <w:p>
+      <w:pPr>
+        <w:rPr>
+          <w:b/>
+          <w:bCs/>
+        </w:rPr>
+      </w:pPr>
+      <w:r>
+        <w:rPr>
+          <w:b/>
+          <w:bCs/>
+        </w:rPr>
+        <w:t xml:space="preserve">8.2 Problem solving </w:t>
+      </w:r>
+    </w:p>
+    <w:p>
+      <w:r>
+        <w:t xml:space="preserve">Aim is to understand the way people solve problems. </w:t>
+      </w:r>
+    </w:p>
+    <w:p>
+      <w:r>
+        <w:t xml:space="preserve">These problems can be simple puzzles (Tower of Hanoi) or more complex problems such as a move in chess or diagnosing a patient. </w:t>
+      </w:r>
+    </w:p>
+    <w:p>
+      <w:r>
+        <w:t>First studies of problem solving :</w:t>
+      </w:r>
+    </w:p>
+    <w:p>
+      <w:r>
+        <w:rPr>
+          <w:b/>
+          <w:bCs/>
+        </w:rPr>
+        <w:t xml:space="preserve">Behaviourism : </w:t>
+      </w:r>
+      <w:r>
+        <w:t xml:space="preserve">Focusing on external behaviours and stimulus based response through trial and error. </w:t>
+      </w:r>
+    </w:p>
+    <w:p>
+      <w:r>
+        <w:rPr>
+          <w:b/>
+          <w:bCs/>
+        </w:rPr>
+        <w:t xml:space="preserve">Gestalt psychologist : </w:t>
+      </w:r>
+      <w:r>
+        <w:t xml:space="preserve"> focusing on internal processing</w:t>
+      </w:r>
+    </w:p>
+    <w:p>
+      <w:r>
+        <w:rPr>
+          <w:b/>
+          <w:bCs/>
+        </w:rPr>
+        <w:t xml:space="preserve">Problem space theory : </w:t>
+      </w:r>
+      <w:r>
+        <w:t xml:space="preserve">Modelling human thought as information processing. </w:t>
       </w:r>
     </w:p>
     <w:p/>
+    <w:p>
+      <w:pPr>
+        <w:rPr>
+          <w:b/>
+          <w:bCs/>
+          <w:u w:val="single"/>
+        </w:rPr>
+      </w:pPr>
+      <w:r>
+        <w:rPr>
+          <w:b/>
+          <w:bCs/>
+          <w:u w:val="single"/>
+        </w:rPr>
+        <w:t>Behaviourism</w:t>
+      </w:r>
+    </w:p>
+    <w:p>
+      <w:r>
+        <w:t>Stimulus-response links</w:t>
+      </w:r>
+    </w:p>
+    <w:p>
+      <w:r>
+        <w:t xml:space="preserve">Example : </w:t>
+      </w:r>
+      <w:proofErr w:type="spellStart"/>
+      <w:r>
+        <w:t>Thorndickes</w:t>
+      </w:r>
+      <w:proofErr w:type="spellEnd"/>
+      <w:r>
+        <w:t xml:space="preserve"> box</w:t>
+      </w:r>
+    </w:p>
+    <w:p>
+      <w:r>
+        <w:t xml:space="preserve">Solution is by trial and error that improves with </w:t>
+      </w:r>
+      <w:r>
+        <w:t xml:space="preserve">reproducing learned responses. </w:t>
+      </w:r>
+    </w:p>
+    <w:p>
+      <w:r>
+        <w:t>However that are many instances where humans do not need trial and error</w:t>
+      </w:r>
+    </w:p>
+    <w:p/>
+    <w:p>
+      <w:r>
+        <w:rPr>
+          <w:b/>
+          <w:bCs/>
+        </w:rPr>
+        <w:t xml:space="preserve">Two types of problem solving : Reproductive and productive problem solving. </w:t>
+      </w:r>
+      <w:r>
+        <w:t>Studies learning during problem solving and studies how people solve new problems</w:t>
+      </w:r>
+    </w:p>
+    <w:p>
+      <w:r>
+        <w:t xml:space="preserve">Problem solving involves </w:t>
+      </w:r>
+      <w:r>
+        <w:rPr>
+          <w:b/>
+          <w:bCs/>
+        </w:rPr>
+        <w:t xml:space="preserve">Restructuring (changing structure of the question). </w:t>
+      </w:r>
+      <w:r>
+        <w:t xml:space="preserve">Change tends to be sudden and characterized by a feeling of </w:t>
+      </w:r>
+      <w:r>
+        <w:rPr>
+          <w:b/>
+          <w:bCs/>
+        </w:rPr>
+        <w:t xml:space="preserve">insight (reorganising elements to provide a sudden solution) </w:t>
+      </w:r>
+      <w:r>
+        <w:t xml:space="preserve">, and AHA experience. </w:t>
+      </w:r>
+    </w:p>
+    <w:p/>
+    <w:p>
+      <w:r>
+        <w:rPr>
+          <w:b/>
+          <w:bCs/>
+        </w:rPr>
+        <w:t xml:space="preserve">Previous knowledge </w:t>
+      </w:r>
+      <w:r>
+        <w:t xml:space="preserve">often hinders problem solving </w:t>
+      </w:r>
+    </w:p>
+    <w:p>
+      <w:pPr>
+        <w:rPr>
+          <w:b/>
+          <w:bCs/>
+        </w:rPr>
+      </w:pPr>
+      <w:proofErr w:type="spellStart"/>
+      <w:r>
+        <w:rPr>
+          <w:b/>
+          <w:bCs/>
+        </w:rPr>
+        <w:t>Dunckers</w:t>
+      </w:r>
+      <w:proofErr w:type="spellEnd"/>
+      <w:r>
+        <w:rPr>
+          <w:b/>
+          <w:bCs/>
+        </w:rPr>
+        <w:t xml:space="preserve"> tumour problem :</w:t>
+      </w:r>
+    </w:p>
+    <w:p>
+      <w:pPr>
+        <w:rPr>
+          <w:b/>
+          <w:bCs/>
+        </w:rPr>
+      </w:pPr>
+      <w:r>
+        <w:rPr>
+          <w:b/>
+          <w:bCs/>
+        </w:rPr>
+        <w:t>Maiers two string problem :</w:t>
+      </w:r>
+    </w:p>
+    <w:p>
+      <w:pPr>
+        <w:rPr>
+          <w:b/>
+          <w:bCs/>
+        </w:rPr>
+      </w:pPr>
+      <w:proofErr w:type="spellStart"/>
+      <w:r>
+        <w:rPr>
+          <w:b/>
+          <w:bCs/>
+        </w:rPr>
+        <w:t>Lunchins</w:t>
+      </w:r>
+      <w:proofErr w:type="spellEnd"/>
+      <w:r>
+        <w:rPr>
+          <w:b/>
+          <w:bCs/>
+        </w:rPr>
+        <w:t xml:space="preserve"> water jug problem :</w:t>
+      </w:r>
+    </w:p>
     <w:sectPr>
       <w:pgSz w:w="11906" w:h="16838"/>
       <w:pgMar w:top="1440" w:right="1440" w:bottom="1440" w:left="1440" w:header="708" w:footer="708" w:gutter="0"/>
@@ -213,8 +438,100 @@
       </w:pPr>
     </w:lvl>
   </w:abstractNum>
+  <w:abstractNum w:abstractNumId="1" w15:restartNumberingAfterBreak="0">
+    <w:nsid w:val="66EF3BA0"/>
+    <w:multiLevelType w:val="hybridMultilevel"/>
+    <w:tmpl w:val="2C8A21F6"/>
+    <w:lvl w:ilvl="0" w:tplc="95181DB6">
+      <w:start w:val="1"/>
+      <w:numFmt w:val="decimal"/>
+      <w:lvlText w:val="%1."/>
+      <w:lvlJc w:val="left"/>
+      <w:pPr>
+        <w:ind w:left="720" w:hanging="360"/>
+      </w:pPr>
+      <w:rPr>
+        <w:rFonts w:hint="default"/>
+      </w:rPr>
+    </w:lvl>
+    <w:lvl w:ilvl="1" w:tplc="08090019" w:tentative="1">
+      <w:start w:val="1"/>
+      <w:numFmt w:val="lowerLetter"/>
+      <w:lvlText w:val="%2."/>
+      <w:lvlJc w:val="left"/>
+      <w:pPr>
+        <w:ind w:left="1440" w:hanging="360"/>
+      </w:pPr>
+    </w:lvl>
+    <w:lvl w:ilvl="2" w:tplc="0809001B" w:tentative="1">
+      <w:start w:val="1"/>
+      <w:numFmt w:val="lowerRoman"/>
+      <w:lvlText w:val="%3."/>
+      <w:lvlJc w:val="right"/>
+      <w:pPr>
+        <w:ind w:left="2160" w:hanging="180"/>
+      </w:pPr>
+    </w:lvl>
+    <w:lvl w:ilvl="3" w:tplc="0809000F" w:tentative="1">
+      <w:start w:val="1"/>
+      <w:numFmt w:val="decimal"/>
+      <w:lvlText w:val="%4."/>
+      <w:lvlJc w:val="left"/>
+      <w:pPr>
+        <w:ind w:left="2880" w:hanging="360"/>
+      </w:pPr>
+    </w:lvl>
+    <w:lvl w:ilvl="4" w:tplc="08090019" w:tentative="1">
+      <w:start w:val="1"/>
+      <w:numFmt w:val="lowerLetter"/>
+      <w:lvlText w:val="%5."/>
+      <w:lvlJc w:val="left"/>
+      <w:pPr>
+        <w:ind w:left="3600" w:hanging="360"/>
+      </w:pPr>
+    </w:lvl>
+    <w:lvl w:ilvl="5" w:tplc="0809001B" w:tentative="1">
+      <w:start w:val="1"/>
+      <w:numFmt w:val="lowerRoman"/>
+      <w:lvlText w:val="%6."/>
+      <w:lvlJc w:val="right"/>
+      <w:pPr>
+        <w:ind w:left="4320" w:hanging="180"/>
+      </w:pPr>
+    </w:lvl>
+    <w:lvl w:ilvl="6" w:tplc="0809000F" w:tentative="1">
+      <w:start w:val="1"/>
+      <w:numFmt w:val="decimal"/>
+      <w:lvlText w:val="%7."/>
+      <w:lvlJc w:val="left"/>
+      <w:pPr>
+        <w:ind w:left="5040" w:hanging="360"/>
+      </w:pPr>
+    </w:lvl>
+    <w:lvl w:ilvl="7" w:tplc="08090019" w:tentative="1">
+      <w:start w:val="1"/>
+      <w:numFmt w:val="lowerLetter"/>
+      <w:lvlText w:val="%8."/>
+      <w:lvlJc w:val="left"/>
+      <w:pPr>
+        <w:ind w:left="5760" w:hanging="360"/>
+      </w:pPr>
+    </w:lvl>
+    <w:lvl w:ilvl="8" w:tplc="0809001B" w:tentative="1">
+      <w:start w:val="1"/>
+      <w:numFmt w:val="lowerRoman"/>
+      <w:lvlText w:val="%9."/>
+      <w:lvlJc w:val="right"/>
+      <w:pPr>
+        <w:ind w:left="6480" w:hanging="180"/>
+      </w:pPr>
+    </w:lvl>
+  </w:abstractNum>
   <w:num w:numId="1" w16cid:durableId="1169293734">
     <w:abstractNumId w:val="0"/>
+  </w:num>
+  <w:num w:numId="2" w16cid:durableId="2004770940">
+    <w:abstractNumId w:val="1"/>
   </w:num>
 </w:numbering>
 </file>

</xml_diff>